<commit_message>
Alinea actividades, glosarios y microobjetivos con el nuevo Contenido
- Microobjetivos: hasta 4 por módulo, breves (regla actualizada).
- Glosarios rehechos desde el Contenido reescrito.
- Actividades en Markdown, con casos reales y guía de autoevaluación;
  las respuestas pasan a respuestas-docente.md (material del docente).
- md-a-word.py genera los cuatro entregables del módulo (--tipo).

Co-Authored-By: Claude Opus 5.5 <noreply@anthropic.com>
</commit_message>
<xml_diff>
--- a/entregables/MODULO 1/Actividades/Actividades.docx
+++ b/entregables/MODULO 1/Actividades/Actividades.docx
@@ -2,6 +2,31 @@
 <file path=word/document.xml><?xml version="1.0" encoding="utf-8"?>
 <w:document xmlns:wpc="http://schemas.microsoft.com/office/word/2010/wordprocessingCanvas" xmlns:mo="http://schemas.microsoft.com/office/mac/office/2008/main" xmlns:mc="http://schemas.openxmlformats.org/markup-compatibility/2006" xmlns:mv="urn:schemas-microsoft-com:mac:vml" xmlns:o="urn:schemas-microsoft-com:office:office" xmlns:r="http://schemas.openxmlformats.org/officeDocument/2006/relationships" xmlns:m="http://schemas.openxmlformats.org/officeDocument/2006/math" xmlns:v="urn:schemas-microsoft-com:vml" xmlns:wp14="http://schemas.microsoft.com/office/word/2010/wordprocessingDrawing" xmlns:wp="http://schemas.openxmlformats.org/drawingml/2006/wordprocessingDrawing" xmlns:w10="urn:schemas-microsoft-com:office:word" xmlns:w="http://schemas.openxmlformats.org/wordprocessingml/2006/main" xmlns:w14="http://schemas.microsoft.com/office/word/2010/wordml" xmlns:wpg="http://schemas.microsoft.com/office/word/2010/wordprocessingGroup" xmlns:wpi="http://schemas.microsoft.com/office/word/2010/wordprocessingInk" xmlns:wne="http://schemas.microsoft.com/office/word/2006/wordml" xmlns:wps="http://schemas.microsoft.com/office/word/2010/wordprocessingShape" mc:Ignorable="w14 wp14">
   <w:body>
+    <w:p>
+      <w:pPr>
+        <w:pStyle w:val="Subtitle"/>
+        <w:keepNext/>
+        <w:spacing w:before="1701"/>
+      </w:pPr>
+      <w:r>
+        <w:rPr>
+          <w:rFonts w:ascii="Calibri" w:hAnsi="Calibri"/>
+          <w:b w:val="0"/>
+          <w:color w:val="536173"/>
+          <w:sz w:val="26"/>
+        </w:rPr>
+        <w:t>Gestión de Proyectos Ágiles</w:t>
+      </w:r>
+    </w:p>
+    <w:p>
+      <w:r>
+        <w:rPr>
+          <w:color w:val="173F67"/>
+          <w:sz w:val="32"/>
+        </w:rPr>
+        <w:t>Módulo 1</w:t>
+      </w:r>
+    </w:p>
     <w:p>
       <w:pPr>
         <w:pStyle w:val="Title"/>
@@ -13,10 +38,325 @@
           <w:rFonts w:ascii="Calibri" w:hAnsi="Calibri"/>
           <w:b w:val="0"/>
           <w:color w:val="000000"/>
-          <w:sz w:val="52"/>
+          <w:sz w:val="58"/>
         </w:rPr>
-        <w:t>Actividades del módulo 1</w:t>
+        <w:t>Gestión de Proyectos y Fundamentos de Agilidad</w:t>
       </w:r>
+    </w:p>
+    <w:p>
+      <w:pPr>
+        <w:pStyle w:val="Subtitle"/>
+        <w:keepNext/>
+      </w:pPr>
+      <w:r>
+        <w:rPr>
+          <w:rFonts w:ascii="Calibri" w:hAnsi="Calibri"/>
+          <w:b w:val="0"/>
+          <w:color w:val="536173"/>
+          <w:sz w:val="26"/>
+        </w:rPr>
+        <w:t>Prácticas autónomas de aplicación</w:t>
+      </w:r>
+    </w:p>
+    <w:p>
+      <w:pPr>
+        <w:pStyle w:val="Subtitle"/>
+        <w:keepNext/>
+      </w:pPr>
+      <w:r>
+        <w:rPr>
+          <w:rFonts w:ascii="Calibri" w:hAnsi="Calibri"/>
+          <w:b w:val="0"/>
+          <w:color w:val="536173"/>
+          <w:sz w:val="26"/>
+        </w:rPr>
+        <w:t>Actividades formativas</w:t>
+      </w:r>
+    </w:p>
+    <w:p>
+      <w:r>
+        <w:br w:type="page"/>
+      </w:r>
+    </w:p>
+    <w:p>
+      <w:pPr>
+        <w:pStyle w:val="Heading1"/>
+        <w:keepNext/>
+      </w:pPr>
+      <w:r>
+        <w:rPr>
+          <w:rFonts w:ascii="Calibri" w:hAnsi="Calibri"/>
+          <w:b/>
+          <w:color w:val="173F67"/>
+          <w:sz w:val="34"/>
+        </w:rPr>
+        <w:t>Actividades formativas</w:t>
+      </w:r>
+    </w:p>
+    <w:p>
+      <w:pPr>
+        <w:spacing w:after="80"/>
+      </w:pPr>
+      <w:hyperlink w:anchor="seccion-1">
+        <w:r>
+          <w:rPr>
+            <w:rStyle w:val="Hyperlink"/>
+          </w:rPr>
+          <w:t xml:space="preserve">Actividad 1: Delimitar el proyecto</w:t>
+        </w:r>
+      </w:hyperlink>
+    </w:p>
+    <w:p>
+      <w:pPr>
+        <w:spacing w:after="80"/>
+      </w:pPr>
+      <w:hyperlink w:anchor="seccion-2">
+        <w:r>
+          <w:rPr>
+            <w:rStyle w:val="Hyperlink"/>
+          </w:rPr>
+          <w:t xml:space="preserve">Actividad 2: Definir el alcance y detectar riesgos</w:t>
+        </w:r>
+      </w:hyperlink>
+    </w:p>
+    <w:p>
+      <w:pPr>
+        <w:spacing w:after="80"/>
+      </w:pPr>
+      <w:hyperlink w:anchor="seccion-3">
+        <w:r>
+          <w:rPr>
+            <w:rStyle w:val="Hyperlink"/>
+          </w:rPr>
+          <w:t xml:space="preserve">Actividad 3: Elegir cómo avanzar</w:t>
+        </w:r>
+      </w:hyperlink>
+    </w:p>
+    <w:p>
+      <w:pPr>
+        <w:spacing w:after="80"/>
+      </w:pPr>
+      <w:hyperlink w:anchor="seccion-4">
+        <w:r>
+          <w:rPr>
+            <w:rStyle w:val="Hyperlink"/>
+          </w:rPr>
+          <w:t xml:space="preserve">Actividad 4: Aplicar los valores ágiles y la idea de valor</w:t>
+        </w:r>
+      </w:hyperlink>
+    </w:p>
+    <w:p>
+      <w:pPr>
+        <w:spacing w:after="80"/>
+      </w:pPr>
+      <w:hyperlink w:anchor="seccion-5">
+        <w:r>
+          <w:rPr>
+            <w:rStyle w:val="Hyperlink"/>
+          </w:rPr>
+          <w:t xml:space="preserve">Actividad 5: Analizar un caso real, el Virtual Case File del FBI</w:t>
+        </w:r>
+      </w:hyperlink>
+    </w:p>
+    <w:p>
+      <w:pPr>
+        <w:spacing w:after="80"/>
+      </w:pPr>
+      <w:hyperlink w:anchor="seccion-6">
+        <w:r>
+          <w:rPr>
+            <w:rStyle w:val="Hyperlink"/>
+          </w:rPr>
+          <w:t xml:space="preserve">Antes de terminar</w:t>
+        </w:r>
+      </w:hyperlink>
+    </w:p>
+    <w:p>
+      <w:r>
+        <w:br w:type="page"/>
+      </w:r>
+    </w:p>
+    <w:p>
+      <w:pPr>
+        <w:spacing w:line="278" w:lineRule="auto" w:after="140"/>
+      </w:pPr>
+      <w:r>
+        <w:rPr>
+          <w:rFonts w:ascii="Calibri" w:hAnsi="Calibri"/>
+          <w:sz w:val="22"/>
+        </w:rPr>
+        <w:t>Estas actividades te ayudan a aplicar lo que estudiaste en el módulo: qué es un proyecto, cómo se define su alcance, qué riesgos tiene, cómo conviene avanzar y qué significa trabajar de forma ágil.</w:t>
+      </w:r>
+    </w:p>
+    <w:tbl>
+      <w:tblPr>
+        <w:tblW w:type="auto" w:w="0"/>
+        <w:tblLayout w:type="fixed"/>
+        <w:tblLook w:firstColumn="1" w:firstRow="1" w:lastColumn="0" w:lastRow="0" w:noHBand="0" w:noVBand="1" w:val="04A0"/>
+      </w:tblPr>
+      <w:tblGrid>
+        <w:gridCol w:w="9412"/>
+      </w:tblGrid>
+      <w:tr>
+        <w:trPr>
+          <w:cantSplit/>
+        </w:trPr>
+        <w:tc>
+          <w:tcPr>
+            <w:tcW w:type="dxa" w:w="9411"/>
+            <w:tcBorders>
+              <w:left w:val="single" w:sz="36" w:color="1F4E86"/>
+              <w:top w:val="single" w:sz="4" w:color="1F4E86"/>
+              <w:bottom w:val="single" w:sz="4" w:color="1F4E86"/>
+              <w:right w:val="single" w:sz="4" w:color="1F4E86"/>
+            </w:tcBorders>
+            <w:shd w:val="clear" w:fill="E8F1FA"/>
+            <w:tcMar>
+              <w:top w:w="140" w:type="dxa"/>
+              <w:bottom w:w="100" w:type="dxa"/>
+              <w:left w:w="220" w:type="dxa"/>
+              <w:right w:w="200" w:type="dxa"/>
+            </w:tcMar>
+          </w:tcPr>
+          <w:p>
+            <w:pPr>
+              <w:spacing w:after="100"/>
+            </w:pPr>
+            <w:r>
+              <w:rPr>
+                <w:rFonts w:ascii="Calibri" w:hAnsi="Calibri"/>
+                <w:b/>
+                <w:color w:val="1F4E86"/>
+                <w:sz w:val="23"/>
+              </w:rPr>
+              <w:t>Cómo usar estas actividades</w:t>
+            </w:r>
+          </w:p>
+          <w:p>
+            <w:pPr>
+              <w:tabs>
+                <w:tab w:pos="340" w:val="left"/>
+              </w:tabs>
+              <w:spacing w:after="80"/>
+              <w:ind w:left="340" w:hanging="255"/>
+            </w:pPr>
+            <w:r>
+              <w:rPr>
+                <w:b/>
+                <w:color w:val="1F4E86"/>
+                <w:sz w:val="21"/>
+              </w:rPr>
+              <w:t>•</w:t>
+              <w:tab/>
+            </w:r>
+            <w:r>
+              <w:rPr>
+                <w:rFonts w:ascii="Calibri" w:hAnsi="Calibri"/>
+                <w:sz w:val="22"/>
+              </w:rPr>
+              <w:t>Son prácticas para vos: no se entregan y no tienen nota.</w:t>
+            </w:r>
+          </w:p>
+          <w:p>
+            <w:pPr>
+              <w:tabs>
+                <w:tab w:pos="340" w:val="left"/>
+              </w:tabs>
+              <w:spacing w:after="80"/>
+              <w:ind w:left="340" w:hanging="255"/>
+            </w:pPr>
+            <w:r>
+              <w:rPr>
+                <w:b/>
+                <w:color w:val="1F4E86"/>
+                <w:sz w:val="21"/>
+              </w:rPr>
+              <w:t>•</w:t>
+              <w:tab/>
+            </w:r>
+            <w:r>
+              <w:rPr>
+                <w:rFonts w:ascii="Calibri" w:hAnsi="Calibri"/>
+                <w:sz w:val="22"/>
+              </w:rPr>
+              <w:t>Resolvé cada consigna en un borrador y usá la lista del final para revisar tu trabajo.</w:t>
+            </w:r>
+          </w:p>
+          <w:p>
+            <w:pPr>
+              <w:tabs>
+                <w:tab w:pos="340" w:val="left"/>
+              </w:tabs>
+              <w:spacing w:after="80"/>
+              <w:ind w:left="340" w:hanging="255"/>
+            </w:pPr>
+            <w:r>
+              <w:rPr>
+                <w:b/>
+                <w:color w:val="1F4E86"/>
+                <w:sz w:val="21"/>
+              </w:rPr>
+              <w:t>•</w:t>
+              <w:tab/>
+            </w:r>
+            <w:r>
+              <w:rPr>
+                <w:rFonts w:ascii="Calibri" w:hAnsi="Calibri"/>
+                <w:sz w:val="22"/>
+              </w:rPr>
+              <w:t>Todas se pueden resolver con el Contenido del módulo. Los datos de las situaciones son didácticos.</w:t>
+            </w:r>
+          </w:p>
+          <w:p>
+            <w:pPr>
+              <w:tabs>
+                <w:tab w:pos="340" w:val="left"/>
+              </w:tabs>
+              <w:spacing w:after="80"/>
+              <w:ind w:left="340" w:hanging="255"/>
+            </w:pPr>
+            <w:r>
+              <w:rPr>
+                <w:b/>
+                <w:color w:val="1F4E86"/>
+                <w:sz w:val="21"/>
+              </w:rPr>
+              <w:t>•</w:t>
+              <w:tab/>
+            </w:r>
+            <w:r>
+              <w:rPr>
+                <w:rFonts w:ascii="Calibri" w:hAnsi="Calibri"/>
+                <w:sz w:val="22"/>
+              </w:rPr>
+              <w:t>No hay una única respuesta correcta: lo importante es que cada decisión esté fundamentada en el Contenido.</w:t>
+            </w:r>
+          </w:p>
+        </w:tc>
+      </w:tr>
+    </w:tbl>
+    <w:p>
+      <w:pPr>
+        <w:spacing w:after="80"/>
+      </w:pPr>
+    </w:p>
+    <w:p>
+      <w:pPr>
+        <w:pStyle w:val="Heading1"/>
+        <w:keepNext/>
+        <w:shd w:fill="EAF4FA"/>
+      </w:pPr>
+      <w:bookmarkStart w:id="1" w:name="seccion-1"/>
+      <w:r>
+        <w:rPr>
+          <w:rFonts w:ascii="Calibri" w:hAnsi="Calibri"/>
+          <w:b/>
+          <w:color w:val="173F67"/>
+          <w:sz w:val="34"/>
+        </w:rPr>
+        <w:t>Actividad 1: Delimitar el proyecto</w:t>
+      </w:r>
+      <w:bookmarkEnd w:id="1"/>
     </w:p>
     <w:p>
       <w:pPr>
@@ -29,19 +369,147 @@
           <w:color w:val="12655D"/>
           <w:sz w:val="22"/>
         </w:rPr>
-        <w:t>Gestión de Proyectos Ágiles · Gestión de Proyectos y Fundamentos de Agilidad</w:t>
+        <w:t>Qué vas a practicar:</w:t>
       </w:r>
-    </w:p>
-    <w:p>
-      <w:pPr>
-        <w:spacing w:line="278" w:lineRule="auto" w:after="140"/>
-      </w:pPr>
       <w:r>
         <w:rPr>
           <w:rFonts w:ascii="Calibri" w:hAnsi="Calibri"/>
           <w:sz w:val="22"/>
         </w:rPr>
-        <w:t>Vas a distinguir qué se gestiona, analizar restricciones y justificar un enfoque de trabajo. Resolvé las consignas en un borrador propio y después compará con las respuestas del final. Son prácticas autónomas, sin entrega ni calificación. Todos los casos y datos son didácticos.</w:t>
+        <w:t xml:space="preserve"> distinguir proyecto, producto y operación, reconocer a los interesados y ubicar las actividades de gestión en el ciclo de vida.</w:t>
+      </w:r>
+    </w:p>
+    <w:tbl>
+      <w:tblPr>
+        <w:tblW w:type="auto" w:w="0"/>
+        <w:tblLayout w:type="fixed"/>
+        <w:tblLook w:firstColumn="1" w:firstRow="1" w:lastColumn="0" w:lastRow="0" w:noHBand="0" w:noVBand="1" w:val="04A0"/>
+      </w:tblPr>
+      <w:tblGrid>
+        <w:gridCol w:w="9412"/>
+      </w:tblGrid>
+      <w:tr>
+        <w:trPr>
+          <w:cantSplit/>
+        </w:trPr>
+        <w:tc>
+          <w:tcPr>
+            <w:tcW w:type="dxa" w:w="9411"/>
+            <w:tcBorders>
+              <w:left w:val="single" w:sz="36" w:color="6A4A9C"/>
+              <w:top w:val="single" w:sz="4" w:color="6A4A9C"/>
+              <w:bottom w:val="single" w:sz="4" w:color="6A4A9C"/>
+              <w:right w:val="single" w:sz="4" w:color="6A4A9C"/>
+            </w:tcBorders>
+            <w:shd w:val="clear" w:fill="F1ECF8"/>
+            <w:tcMar>
+              <w:top w:w="140" w:type="dxa"/>
+              <w:bottom w:w="100" w:type="dxa"/>
+              <w:left w:w="220" w:type="dxa"/>
+              <w:right w:w="200" w:type="dxa"/>
+            </w:tcMar>
+          </w:tcPr>
+          <w:p>
+            <w:pPr>
+              <w:spacing w:after="100"/>
+            </w:pPr>
+            <w:r>
+              <w:rPr>
+                <w:rFonts w:ascii="Calibri" w:hAnsi="Calibri"/>
+                <w:b/>
+                <w:color w:val="6A4A9C"/>
+                <w:sz w:val="23"/>
+              </w:rPr>
+              <w:t>Situación</w:t>
+            </w:r>
+          </w:p>
+          <w:p>
+            <w:pPr>
+              <w:spacing w:after="120" w:line="276" w:lineRule="auto"/>
+            </w:pPr>
+            <w:r>
+              <w:rPr>
+                <w:rFonts w:ascii="Calibri" w:hAnsi="Calibri"/>
+                <w:sz w:val="22"/>
+              </w:rPr>
+              <w:t>Una universidad prepara en seis semanas un piloto del asistente con IA que orienta a los estudiantes sobre inscripciones. La oficina de alumnos valida la información, un grupo de estudiantes prueba las respuestas y una dirección autoriza el presupuesto. Cuando el asistente esté habilitado, un equipo atenderá los incidentes y actualizará los documentos cada semana.</w:t>
+            </w:r>
+          </w:p>
+        </w:tc>
+      </w:tr>
+    </w:tbl>
+    <w:p>
+      <w:pPr>
+        <w:spacing w:after="80"/>
+      </w:pPr>
+    </w:p>
+    <w:p>
+      <w:pPr>
+        <w:tabs>
+          <w:tab w:pos="425" w:val="left"/>
+        </w:tabs>
+        <w:spacing w:after="100"/>
+        <w:ind w:left="425" w:hanging="312"/>
+      </w:pPr>
+      <w:r>
+        <w:rPr>
+          <w:b/>
+        </w:rPr>
+        <w:t>1.</w:t>
+        <w:tab/>
+      </w:r>
+      <w:r>
+        <w:rPr>
+          <w:rFonts w:ascii="Calibri" w:hAnsi="Calibri"/>
+          <w:sz w:val="22"/>
+        </w:rPr>
+        <w:t>Identificá el proyecto, el producto y dos tareas de operación. ¿Qué resultado permitiría cerrar el proyecto piloto, aunque el producto siga funcionando?</w:t>
+      </w:r>
+    </w:p>
+    <w:p>
+      <w:pPr>
+        <w:tabs>
+          <w:tab w:pos="425" w:val="left"/>
+        </w:tabs>
+        <w:spacing w:after="100"/>
+        <w:ind w:left="425" w:hanging="312"/>
+      </w:pPr>
+      <w:r>
+        <w:rPr>
+          <w:b/>
+        </w:rPr>
+        <w:t>2.</w:t>
+        <w:tab/>
+      </w:r>
+      <w:r>
+        <w:rPr>
+          <w:rFonts w:ascii="Calibri" w:hAnsi="Calibri"/>
+          <w:sz w:val="22"/>
+        </w:rPr>
+        <w:t>Distinguí al cliente, a los usuarios, al patrocinador y a los especialistas del tema. Ubicá a cada uno en la matriz de poder e interés y proponé cómo involucrar a dos de ellos.</w:t>
+      </w:r>
+    </w:p>
+    <w:p>
+      <w:pPr>
+        <w:tabs>
+          <w:tab w:pos="425" w:val="left"/>
+        </w:tabs>
+        <w:spacing w:after="100"/>
+        <w:ind w:left="425" w:hanging="312"/>
+      </w:pPr>
+      <w:r>
+        <w:rPr>
+          <w:b/>
+        </w:rPr>
+        <w:t>3.</w:t>
+        <w:tab/>
+      </w:r>
+      <w:r>
+        <w:rPr>
+          <w:rFonts w:ascii="Calibri" w:hAnsi="Calibri"/>
+          <w:sz w:val="22"/>
+        </w:rPr>
+        <w:t>Relacioná cada acción con un grupo de actividades del ciclo de vida: autorizar el piloto, organizar las pruebas, construir el asistente, comparar las respuestas con lo esperado y transferir el soporte al equipo de operación. ¿Hay que esperar al final para monitorear y controlar?</w:t>
       </w:r>
     </w:p>
     <w:p>
@@ -50,15 +518,17 @@
         <w:keepNext/>
         <w:shd w:fill="EAF4FA"/>
       </w:pPr>
+      <w:bookmarkStart w:id="2" w:name="seccion-2"/>
       <w:r>
         <w:rPr>
           <w:rFonts w:ascii="Calibri" w:hAnsi="Calibri"/>
           <w:b/>
-          <w:color w:val="000000"/>
-          <w:sz w:val="32"/>
+          <w:color w:val="173F67"/>
+          <w:sz w:val="34"/>
         </w:rPr>
-        <w:t>Actividad 1 Delimitar el proyecto</w:t>
+        <w:t>Actividad 2: Definir el alcance y detectar riesgos</w:t>
       </w:r>
+      <w:bookmarkEnd w:id="2"/>
     </w:p>
     <w:p>
       <w:pPr>
@@ -71,62 +541,274 @@
           <w:color w:val="12655D"/>
           <w:sz w:val="22"/>
         </w:rPr>
-        <w:t>Contexto general.</w:t>
+        <w:t>Qué vas a practicar:</w:t>
       </w:r>
       <w:r>
         <w:rPr>
           <w:rFonts w:ascii="Calibri" w:hAnsi="Calibri"/>
           <w:sz w:val="22"/>
         </w:rPr>
-        <w:t xml:space="preserve"> Una universidad prepara en seis semanas un piloto de un asistente con IA que orienta sobre inscripciones. La oficina de alumnos valida la información; estudiantes prueban las respuestas; una dirección autoriza el presupuesto. Una vez habilitado, un equipo atiende incidentes y actualiza documentos cada semana.</w:t>
+        <w:t xml:space="preserve"> definir qué entra y qué queda afuera, escribir criterios de aceptación, dividir el trabajo y encontrar riesgos.</w:t>
       </w:r>
+    </w:p>
+    <w:tbl>
+      <w:tblPr>
+        <w:tblW w:type="auto" w:w="0"/>
+        <w:tblLayout w:type="fixed"/>
+        <w:tblLook w:firstColumn="1" w:firstRow="1" w:lastColumn="0" w:lastRow="0" w:noHBand="0" w:noVBand="1" w:val="04A0"/>
+      </w:tblPr>
+      <w:tblGrid>
+        <w:gridCol w:w="9412"/>
+      </w:tblGrid>
+      <w:tr>
+        <w:trPr>
+          <w:cantSplit/>
+        </w:trPr>
+        <w:tc>
+          <w:tcPr>
+            <w:tcW w:type="dxa" w:w="9411"/>
+            <w:tcBorders>
+              <w:left w:val="single" w:sz="36" w:color="6A4A9C"/>
+              <w:top w:val="single" w:sz="4" w:color="6A4A9C"/>
+              <w:bottom w:val="single" w:sz="4" w:color="6A4A9C"/>
+              <w:right w:val="single" w:sz="4" w:color="6A4A9C"/>
+            </w:tcBorders>
+            <w:shd w:val="clear" w:fill="F1ECF8"/>
+            <w:tcMar>
+              <w:top w:w="140" w:type="dxa"/>
+              <w:bottom w:w="100" w:type="dxa"/>
+              <w:left w:w="220" w:type="dxa"/>
+              <w:right w:w="200" w:type="dxa"/>
+            </w:tcMar>
+          </w:tcPr>
+          <w:p>
+            <w:pPr>
+              <w:spacing w:after="100"/>
+            </w:pPr>
+            <w:r>
+              <w:rPr>
+                <w:rFonts w:ascii="Calibri" w:hAnsi="Calibri"/>
+                <w:b/>
+                <w:color w:val="6A4A9C"/>
+                <w:sz w:val="23"/>
+              </w:rPr>
+              <w:t>Situación</w:t>
+            </w:r>
+          </w:p>
+          <w:p>
+            <w:pPr>
+              <w:spacing w:after="120" w:line="276" w:lineRule="auto"/>
+            </w:pPr>
+            <w:r>
+              <w:rPr>
+                <w:rFonts w:ascii="Calibri" w:hAnsi="Calibri"/>
+                <w:sz w:val="22"/>
+              </w:rPr>
+              <w:t>Después del piloto de inscripciones, la universidad pide "que el asistente también ayude con las becas". Nadie definió todavía qué significa eso: algunos imaginan que solo informe las becas disponibles; otros, que permita postularse y consultar el estado de la solicitud.</w:t>
+            </w:r>
+          </w:p>
+        </w:tc>
+      </w:tr>
+    </w:tbl>
+    <w:p>
+      <w:pPr>
+        <w:spacing w:after="80"/>
+      </w:pPr>
     </w:p>
     <w:p>
       <w:pPr>
-        <w:numPr>
-          <w:ilvl w:val="0"/>
-          <w:numId w:val="10"/>
-        </w:numPr>
-        <w:spacing w:line="278" w:lineRule="auto" w:after="140"/>
+        <w:tabs>
+          <w:tab w:pos="425" w:val="left"/>
+        </w:tabs>
+        <w:spacing w:after="100"/>
+        <w:ind w:left="425" w:hanging="312"/>
       </w:pPr>
+      <w:r>
+        <w:rPr>
+          <w:b/>
+        </w:rPr>
+        <w:t>1.</w:t>
+        <w:tab/>
+      </w:r>
       <w:r>
         <w:rPr>
           <w:rFonts w:ascii="Calibri" w:hAnsi="Calibri"/>
           <w:sz w:val="22"/>
         </w:rPr>
-        <w:t>Identificá proyecto, producto y dos tareas de operación. Indicá qué resultado permitiría cerrar el proyecto piloto aunque el producto continúe.</w:t>
+        <w:t>Armá una tabla con tres elementos que incluirías en este nuevo alcance y tres que dejarías afuera por ahora. Justificá cada exclusión.</w:t>
       </w:r>
     </w:p>
     <w:p>
       <w:pPr>
-        <w:numPr>
-          <w:ilvl w:val="0"/>
-          <w:numId w:val="10"/>
-        </w:numPr>
-        <w:spacing w:line="278" w:lineRule="auto" w:after="140"/>
+        <w:tabs>
+          <w:tab w:pos="425" w:val="left"/>
+        </w:tabs>
+        <w:spacing w:after="100"/>
+        <w:ind w:left="425" w:hanging="312"/>
       </w:pPr>
+      <w:r>
+        <w:rPr>
+          <w:b/>
+        </w:rPr>
+        <w:t>2.</w:t>
+        <w:tab/>
+      </w:r>
       <w:r>
         <w:rPr>
           <w:rFonts w:ascii="Calibri" w:hAnsi="Calibri"/>
           <w:sz w:val="22"/>
         </w:rPr>
-        <w:t>Distinguí cliente, usuarios, sponsor y especialistas del dominio. Elegí dos interesados y proponé cómo involucrarlos; explicá qué información perderías si no participaran.</w:t>
+        <w:t>Escribí dos entregables concretos, cada uno con dos criterios de aceptación que se puedan comprobar.</w:t>
       </w:r>
     </w:p>
     <w:p>
       <w:pPr>
-        <w:numPr>
-          <w:ilvl w:val="0"/>
-          <w:numId w:val="10"/>
-        </w:numPr>
-        <w:spacing w:line="278" w:lineRule="auto" w:after="140"/>
+        <w:tabs>
+          <w:tab w:pos="425" w:val="left"/>
+        </w:tabs>
+        <w:spacing w:after="100"/>
+        <w:ind w:left="425" w:hanging="312"/>
       </w:pPr>
+      <w:r>
+        <w:rPr>
+          <w:b/>
+        </w:rPr>
+        <w:t>3.</w:t>
+        <w:tab/>
+      </w:r>
       <w:r>
         <w:rPr>
           <w:rFonts w:ascii="Calibri" w:hAnsi="Calibri"/>
           <w:sz w:val="22"/>
         </w:rPr>
-        <w:t>Relacioná estas acciones con funciones de gestión: autorizar el piloto; organizar las pruebas; integrar el asistente; comparar respuestas con lo esperado; transferir responsabilidades de soporte. ¿Es necesario esperar al final para monitorear y controlar?</w:t>
+        <w:t>Hacé un primer desglose del trabajo en cuatro partes, con dos tareas en cada una.</w:t>
+      </w:r>
+    </w:p>
+    <w:p>
+      <w:pPr>
+        <w:tabs>
+          <w:tab w:pos="425" w:val="left"/>
+        </w:tabs>
+        <w:spacing w:after="100"/>
+        <w:ind w:left="425" w:hanging="312"/>
+      </w:pPr>
+      <w:r>
+        <w:rPr>
+          <w:b/>
+        </w:rPr>
+        <w:t>4.</w:t>
+        <w:tab/>
+      </w:r>
+      <w:r>
+        <w:rPr>
+          <w:rFonts w:ascii="Calibri" w:hAnsi="Calibri"/>
+          <w:sz w:val="22"/>
+        </w:rPr>
+        <w:t>Identificá tres riesgos. Para cada uno, indicá su probabilidad (alta, media o baja), su impacto y una respuesta: evitar, reducir, transferir o aceptar.</w:t>
+      </w:r>
+    </w:p>
+    <w:p>
+      <w:pPr>
+        <w:tabs>
+          <w:tab w:pos="425" w:val="left"/>
+        </w:tabs>
+        <w:spacing w:after="100"/>
+        <w:ind w:left="425" w:hanging="312"/>
+      </w:pPr>
+      <w:r>
+        <w:rPr>
+          <w:b/>
+        </w:rPr>
+        <w:t>5.</w:t>
+        <w:tab/>
+      </w:r>
+      <w:r>
+        <w:rPr>
+          <w:rFonts w:ascii="Calibri" w:hAnsi="Calibri"/>
+          <w:sz w:val="22"/>
+        </w:rPr>
+        <w:t xml:space="preserve">Clasificá estas dos situaciones como expansión descontrolada del alcance o </w:t>
+      </w:r>
+      <w:r>
+        <w:rPr>
+          <w:rFonts w:ascii="Calibri" w:hAnsi="Calibri"/>
+          <w:i/>
+          <w:sz w:val="22"/>
+        </w:rPr>
+        <w:t>gold plating</w:t>
+      </w:r>
+      <w:r>
+        <w:rPr>
+          <w:rFonts w:ascii="Calibri" w:hAnsi="Calibri"/>
+          <w:sz w:val="22"/>
+        </w:rPr>
+        <w:t>, y explicá qué harías en cada caso:</w:t>
+      </w:r>
+    </w:p>
+    <w:p>
+      <w:pPr>
+        <w:tabs>
+          <w:tab w:pos="794" w:val="left"/>
+        </w:tabs>
+        <w:spacing w:after="60"/>
+        <w:ind w:left="794" w:hanging="255"/>
+      </w:pPr>
+      <w:r>
+        <w:rPr>
+          <w:b/>
+          <w:color w:val="12655D"/>
+        </w:rPr>
+        <w:t>◦</w:t>
+        <w:tab/>
+      </w:r>
+      <w:r>
+        <w:rPr>
+          <w:rFonts w:ascii="Calibri" w:hAnsi="Calibri"/>
+          <w:b/>
+          <w:color w:val="12655D"/>
+          <w:sz w:val="22"/>
+        </w:rPr>
+        <w:t>a)</w:t>
+      </w:r>
+      <w:r>
+        <w:rPr>
+          <w:rFonts w:ascii="Calibri" w:hAnsi="Calibri"/>
+          <w:sz w:val="22"/>
+        </w:rPr>
+        <w:t xml:space="preserve"> A mitad del trabajo, una autoridad pide por correo "agregar también las becas de posgrado, que es rápido".</w:t>
+      </w:r>
+    </w:p>
+    <w:p>
+      <w:pPr>
+        <w:tabs>
+          <w:tab w:pos="794" w:val="left"/>
+        </w:tabs>
+        <w:spacing w:after="60"/>
+        <w:ind w:left="794" w:hanging="255"/>
+      </w:pPr>
+      <w:r>
+        <w:rPr>
+          <w:b/>
+          <w:color w:val="12655D"/>
+        </w:rPr>
+        <w:t>◦</w:t>
+        <w:tab/>
+      </w:r>
+      <w:r>
+        <w:rPr>
+          <w:rFonts w:ascii="Calibri" w:hAnsi="Calibri"/>
+          <w:b/>
+          <w:color w:val="12655D"/>
+          <w:sz w:val="22"/>
+        </w:rPr>
+        <w:t>b)</w:t>
+      </w:r>
+      <w:r>
+        <w:rPr>
+          <w:rFonts w:ascii="Calibri" w:hAnsi="Calibri"/>
+          <w:sz w:val="22"/>
+        </w:rPr>
+        <w:t xml:space="preserve"> Un programador agrega por su cuenta una animación en la pantalla de becas "porque queda más linda".</w:t>
       </w:r>
     </w:p>
     <w:p>
@@ -135,15 +817,17 @@
         <w:keepNext/>
         <w:shd w:fill="EAF4FA"/>
       </w:pPr>
+      <w:bookmarkStart w:id="3" w:name="seccion-3"/>
       <w:r>
         <w:rPr>
           <w:rFonts w:ascii="Calibri" w:hAnsi="Calibri"/>
           <w:b/>
-          <w:color w:val="000000"/>
-          <w:sz w:val="32"/>
+          <w:color w:val="173F67"/>
+          <w:sz w:val="34"/>
         </w:rPr>
-        <w:t>Actividad 2 Elegir cómo avanzar</w:t>
+        <w:t>Actividad 3: Elegir cómo avanzar</w:t>
       </w:r>
+      <w:bookmarkEnd w:id="3"/>
     </w:p>
     <w:p>
       <w:pPr>
@@ -156,62 +840,183 @@
           <w:color w:val="12655D"/>
           <w:sz w:val="22"/>
         </w:rPr>
-        <w:t>Contexto general.</w:t>
+        <w:t>Qué vas a practicar:</w:t>
       </w:r>
       <w:r>
         <w:rPr>
           <w:rFonts w:ascii="Calibri" w:hAnsi="Calibri"/>
           <w:sz w:val="22"/>
         </w:rPr>
-        <w:t xml:space="preserve"> Compará tres trabajos: A) trasladar documentos a un repositorio con formato y procedimiento ya probados; B) descubrir cómo responder consultas que los estudiantes formulan de maneras impredecibles; C) coordinar una migración con fecha fija y, al mismo tiempo, explorar la interacción del asistente.</w:t>
+        <w:t xml:space="preserve"> elegir entre enfoques predictivo, ágil e híbrido, distinguir iteración de incremento y decidir frente a la triple restricción.</w:t>
       </w:r>
+    </w:p>
+    <w:tbl>
+      <w:tblPr>
+        <w:tblW w:type="auto" w:w="0"/>
+        <w:tblLayout w:type="fixed"/>
+        <w:tblLook w:firstColumn="1" w:firstRow="1" w:lastColumn="0" w:lastRow="0" w:noHBand="0" w:noVBand="1" w:val="04A0"/>
+      </w:tblPr>
+      <w:tblGrid>
+        <w:gridCol w:w="9412"/>
+      </w:tblGrid>
+      <w:tr>
+        <w:trPr>
+          <w:cantSplit/>
+        </w:trPr>
+        <w:tc>
+          <w:tcPr>
+            <w:tcW w:type="dxa" w:w="9411"/>
+            <w:tcBorders>
+              <w:left w:val="single" w:sz="36" w:color="6A4A9C"/>
+              <w:top w:val="single" w:sz="4" w:color="6A4A9C"/>
+              <w:bottom w:val="single" w:sz="4" w:color="6A4A9C"/>
+              <w:right w:val="single" w:sz="4" w:color="6A4A9C"/>
+            </w:tcBorders>
+            <w:shd w:val="clear" w:fill="F1ECF8"/>
+            <w:tcMar>
+              <w:top w:w="140" w:type="dxa"/>
+              <w:bottom w:w="100" w:type="dxa"/>
+              <w:left w:w="220" w:type="dxa"/>
+              <w:right w:w="200" w:type="dxa"/>
+            </w:tcMar>
+          </w:tcPr>
+          <w:p>
+            <w:pPr>
+              <w:spacing w:after="100"/>
+            </w:pPr>
+            <w:r>
+              <w:rPr>
+                <w:rFonts w:ascii="Calibri" w:hAnsi="Calibri"/>
+                <w:b/>
+                <w:color w:val="6A4A9C"/>
+                <w:sz w:val="23"/>
+              </w:rPr>
+              <w:t>Situación</w:t>
+            </w:r>
+          </w:p>
+          <w:p>
+            <w:pPr>
+              <w:spacing w:after="120" w:line="276" w:lineRule="auto"/>
+            </w:pPr>
+            <w:r>
+              <w:rPr>
+                <w:rFonts w:ascii="Calibri" w:hAnsi="Calibri"/>
+                <w:sz w:val="22"/>
+              </w:rPr>
+              <w:t>El equipo tiene tres trabajos distintos:</w:t>
+            </w:r>
+          </w:p>
+          <w:p>
+            <w:pPr>
+              <w:spacing w:after="120" w:line="276" w:lineRule="auto"/>
+            </w:pPr>
+            <w:r>
+              <w:rPr>
+                <w:rFonts w:ascii="Calibri" w:hAnsi="Calibri"/>
+                <w:sz w:val="22"/>
+              </w:rPr>
+              <w:t>A) Trasladar documentos a un repositorio con un formato y un procedimiento ya probados en otras facultades.</w:t>
+            </w:r>
+          </w:p>
+          <w:p>
+            <w:pPr>
+              <w:spacing w:after="120" w:line="276" w:lineRule="auto"/>
+            </w:pPr>
+            <w:r>
+              <w:rPr>
+                <w:rFonts w:ascii="Calibri" w:hAnsi="Calibri"/>
+                <w:sz w:val="22"/>
+              </w:rPr>
+              <w:t>B) Descubrir cómo responder consultas que los estudiantes formulan de maneras impredecibles.</w:t>
+            </w:r>
+          </w:p>
+          <w:p>
+            <w:pPr>
+              <w:spacing w:after="120" w:line="276" w:lineRule="auto"/>
+            </w:pPr>
+            <w:r>
+              <w:rPr>
+                <w:rFonts w:ascii="Calibri" w:hAnsi="Calibri"/>
+                <w:sz w:val="22"/>
+              </w:rPr>
+              <w:t>C) Coordinar una migración de sistemas con fecha fija y, al mismo tiempo, explorar cómo interactúan los estudiantes con el asistente.</w:t>
+            </w:r>
+          </w:p>
+        </w:tc>
+      </w:tr>
+    </w:tbl>
+    <w:p>
+      <w:pPr>
+        <w:spacing w:after="80"/>
+      </w:pPr>
     </w:p>
     <w:p>
       <w:pPr>
-        <w:numPr>
-          <w:ilvl w:val="0"/>
-          <w:numId w:val="11"/>
-        </w:numPr>
-        <w:spacing w:line="278" w:lineRule="auto" w:after="140"/>
+        <w:tabs>
+          <w:tab w:pos="425" w:val="left"/>
+        </w:tabs>
+        <w:spacing w:after="100"/>
+        <w:ind w:left="425" w:hanging="312"/>
       </w:pPr>
+      <w:r>
+        <w:rPr>
+          <w:b/>
+        </w:rPr>
+        <w:t>1.</w:t>
+        <w:tab/>
+      </w:r>
       <w:r>
         <w:rPr>
           <w:rFonts w:ascii="Calibri" w:hAnsi="Calibri"/>
           <w:sz w:val="22"/>
         </w:rPr>
-        <w:t>Elegí un enfoque predictivo, adaptativo o híbrido para cada trabajo. Fundamentá con incertidumbre, posibilidad de obtener feedback y restricciones. Indicá un dato adicional que podría cambiar tu decisión.</w:t>
+        <w:t>Elegí un enfoque predictivo, ágil o híbrido para cada trabajo. Fundamentá con la incertidumbre y el costo de cambiar. Indicá un dato adicional que podría cambiar tu decisión.</w:t>
       </w:r>
     </w:p>
     <w:p>
       <w:pPr>
-        <w:numPr>
-          <w:ilvl w:val="0"/>
-          <w:numId w:val="11"/>
-        </w:numPr>
-        <w:spacing w:line="278" w:lineRule="auto" w:after="140"/>
+        <w:tabs>
+          <w:tab w:pos="425" w:val="left"/>
+        </w:tabs>
+        <w:spacing w:after="100"/>
+        <w:ind w:left="425" w:hanging="312"/>
       </w:pPr>
+      <w:r>
+        <w:rPr>
+          <w:b/>
+        </w:rPr>
+        <w:t>2.</w:t>
+        <w:tab/>
+      </w:r>
       <w:r>
         <w:rPr>
           <w:rFonts w:ascii="Calibri" w:hAnsi="Calibri"/>
           <w:sz w:val="22"/>
         </w:rPr>
-        <w:t>Clasificá estas acciones como iteración, incremento o ambas: mejorar la claridad de respuestas existentes; incorporar consultas sobre becas como nueva capacidad utilizable; agregar becas y ajustar sus respuestas a partir de pruebas.</w:t>
+        <w:t>Clasificá estas acciones como iteración, incremento o ambas: mejorar la claridad de respuestas que ya existen; sumar consultas sobre becas como capacidad nueva; sumar becas y ajustar sus respuestas a partir de las pruebas.</w:t>
       </w:r>
     </w:p>
     <w:p>
       <w:pPr>
-        <w:numPr>
-          <w:ilvl w:val="0"/>
-          <w:numId w:val="11"/>
-        </w:numPr>
-        <w:spacing w:line="278" w:lineRule="auto" w:after="140"/>
+        <w:tabs>
+          <w:tab w:pos="425" w:val="left"/>
+        </w:tabs>
+        <w:spacing w:after="100"/>
+        <w:ind w:left="425" w:hanging="312"/>
       </w:pPr>
+      <w:r>
+        <w:rPr>
+          <w:b/>
+        </w:rPr>
+        <w:t>3.</w:t>
+        <w:tab/>
+      </w:r>
       <w:r>
         <w:rPr>
           <w:rFonts w:ascii="Calibri" w:hAnsi="Calibri"/>
           <w:sz w:val="22"/>
         </w:rPr>
-        <w:t>En el piloto se pide agregar consultas de becas manteniendo fecha y presupuesto. Proponé dos alternativas de alcance y explicá qué conservarías para cuidar la calidad. ¿Quiénes necesitan participar de la decisión?</w:t>
+        <w:t>En el piloto se pide agregar consultas de becas sin mover la fecha ni el presupuesto. Según la triple restricción, ¿qué variable se tendría que ajustar? Proponé dos alternativas y explicá por qué no conviene recortar las pruebas.</w:t>
       </w:r>
     </w:p>
     <w:p>
@@ -220,15 +1025,17 @@
         <w:keepNext/>
         <w:shd w:fill="EAF4FA"/>
       </w:pPr>
+      <w:bookmarkStart w:id="4" w:name="seccion-4"/>
       <w:r>
         <w:rPr>
           <w:rFonts w:ascii="Calibri" w:hAnsi="Calibri"/>
           <w:b/>
-          <w:color w:val="000000"/>
-          <w:sz w:val="32"/>
+          <w:color w:val="173F67"/>
+          <w:sz w:val="34"/>
         </w:rPr>
-        <w:t>Actividad 3 Interpretar los valores ágiles</w:t>
+        <w:t>Actividad 4: Aplicar los valores ágiles y la idea de valor</w:t>
       </w:r>
+      <w:bookmarkEnd w:id="4"/>
     </w:p>
     <w:p>
       <w:pPr>
@@ -241,63 +1048,272 @@
           <w:color w:val="12655D"/>
           <w:sz w:val="22"/>
         </w:rPr>
-        <w:t>Fundamentos de agilidad.</w:t>
+        <w:t>Qué vas a practicar:</w:t>
       </w:r>
       <w:r>
         <w:rPr>
           <w:rFonts w:ascii="Calibri" w:hAnsi="Calibri"/>
           <w:sz w:val="22"/>
         </w:rPr>
-        <w:t xml:space="preserve"> En una reunión se escuchan cuatro frases: A) «Como somos ágiles, no necesitamos registrar las fuentes del asistente»; B) «El plan está aprobado, así que no vamos a corregir una necesidad mal entendida»; C) «Si hay un tablero actualizado, ya no hace falta conversar con alumnos»; D) «Podemos ajustar el plan con el cliente y documentar el acuerdo».</w:t>
+        <w:t xml:space="preserve"> interpretar el Manifiesto Ágil y distinguir actividad, resultado y beneficio.</w:t>
       </w:r>
+    </w:p>
+    <w:tbl>
+      <w:tblPr>
+        <w:tblW w:type="auto" w:w="0"/>
+        <w:tblLayout w:type="fixed"/>
+        <w:tblLook w:firstColumn="1" w:firstRow="1" w:lastColumn="0" w:lastRow="0" w:noHBand="0" w:noVBand="1" w:val="04A0"/>
+      </w:tblPr>
+      <w:tblGrid>
+        <w:gridCol w:w="9412"/>
+      </w:tblGrid>
+      <w:tr>
+        <w:trPr>
+          <w:cantSplit/>
+        </w:trPr>
+        <w:tc>
+          <w:tcPr>
+            <w:tcW w:type="dxa" w:w="9411"/>
+            <w:tcBorders>
+              <w:left w:val="single" w:sz="36" w:color="6A4A9C"/>
+              <w:top w:val="single" w:sz="4" w:color="6A4A9C"/>
+              <w:bottom w:val="single" w:sz="4" w:color="6A4A9C"/>
+              <w:right w:val="single" w:sz="4" w:color="6A4A9C"/>
+            </w:tcBorders>
+            <w:shd w:val="clear" w:fill="F1ECF8"/>
+            <w:tcMar>
+              <w:top w:w="140" w:type="dxa"/>
+              <w:bottom w:w="100" w:type="dxa"/>
+              <w:left w:w="220" w:type="dxa"/>
+              <w:right w:w="200" w:type="dxa"/>
+            </w:tcMar>
+          </w:tcPr>
+          <w:p>
+            <w:pPr>
+              <w:spacing w:after="100"/>
+            </w:pPr>
+            <w:r>
+              <w:rPr>
+                <w:rFonts w:ascii="Calibri" w:hAnsi="Calibri"/>
+                <w:b/>
+                <w:color w:val="6A4A9C"/>
+                <w:sz w:val="23"/>
+              </w:rPr>
+              <w:t>Situación</w:t>
+            </w:r>
+          </w:p>
+          <w:p>
+            <w:pPr>
+              <w:spacing w:after="120" w:line="276" w:lineRule="auto"/>
+            </w:pPr>
+            <w:r>
+              <w:rPr>
+                <w:rFonts w:ascii="Calibri" w:hAnsi="Calibri"/>
+                <w:sz w:val="22"/>
+              </w:rPr>
+              <w:t>En una reunión del equipo se escuchan cuatro frases:</w:t>
+            </w:r>
+          </w:p>
+          <w:p>
+            <w:pPr>
+              <w:spacing w:after="120" w:line="276" w:lineRule="auto"/>
+            </w:pPr>
+            <w:r>
+              <w:rPr>
+                <w:rFonts w:ascii="Calibri" w:hAnsi="Calibri"/>
+                <w:sz w:val="22"/>
+              </w:rPr>
+              <w:t>A) "Como somos ágiles, no necesitamos registrar de dónde salen las respuestas del asistente."</w:t>
+            </w:r>
+          </w:p>
+          <w:p>
+            <w:pPr>
+              <w:spacing w:after="120" w:line="276" w:lineRule="auto"/>
+            </w:pPr>
+            <w:r>
+              <w:rPr>
+                <w:rFonts w:ascii="Calibri" w:hAnsi="Calibri"/>
+                <w:sz w:val="22"/>
+              </w:rPr>
+              <w:t>B) "El plan está aprobado, así que no vamos a corregir una necesidad que entendimos mal."</w:t>
+            </w:r>
+          </w:p>
+          <w:p>
+            <w:pPr>
+              <w:spacing w:after="120" w:line="276" w:lineRule="auto"/>
+            </w:pPr>
+            <w:r>
+              <w:rPr>
+                <w:rFonts w:ascii="Calibri" w:hAnsi="Calibri"/>
+                <w:sz w:val="22"/>
+              </w:rPr>
+              <w:t>C) "Si el tablero está actualizado, ya no hace falta conversar con la oficina de alumnos."</w:t>
+            </w:r>
+          </w:p>
+          <w:p>
+            <w:pPr>
+              <w:spacing w:after="120" w:line="276" w:lineRule="auto"/>
+            </w:pPr>
+            <w:r>
+              <w:rPr>
+                <w:rFonts w:ascii="Calibri" w:hAnsi="Calibri"/>
+                <w:sz w:val="22"/>
+              </w:rPr>
+              <w:t>D) "Podemos ajustar el plan con la universidad y dejar el acuerdo por escrito."</w:t>
+            </w:r>
+          </w:p>
+          <w:p>
+            <w:pPr>
+              <w:spacing w:after="120" w:line="276" w:lineRule="auto"/>
+            </w:pPr>
+            <w:r>
+              <w:rPr>
+                <w:rFonts w:ascii="Calibri" w:hAnsi="Calibri"/>
+                <w:sz w:val="22"/>
+              </w:rPr>
+              <w:t>Además, el equipo informa estos datos: cargó 40 documentos y completó 25 tareas. En una prueba con 20 consultas definidas de antemano, el asistente respondió bien 12; después de una revisión, respondió bien 16 de las mismas 20. Todavía no se probó si los estudiantes entienden las respuestas.</w:t>
+            </w:r>
+          </w:p>
+        </w:tc>
+      </w:tr>
+    </w:tbl>
+    <w:p>
+      <w:pPr>
+        <w:spacing w:after="80"/>
+      </w:pPr>
     </w:p>
     <w:p>
       <w:pPr>
-        <w:numPr>
-          <w:ilvl w:val="0"/>
-          <w:numId w:val="12"/>
-        </w:numPr>
-        <w:spacing w:line="278" w:lineRule="auto" w:after="140"/>
+        <w:tabs>
+          <w:tab w:pos="425" w:val="left"/>
+        </w:tabs>
+        <w:spacing w:after="100"/>
+        <w:ind w:left="425" w:hanging="312"/>
       </w:pPr>
+      <w:r>
+        <w:rPr>
+          <w:b/>
+        </w:rPr>
+        <w:t>1.</w:t>
+        <w:tab/>
+      </w:r>
       <w:r>
         <w:rPr>
           <w:rFonts w:ascii="Calibri" w:hAnsi="Calibri"/>
           <w:sz w:val="22"/>
         </w:rPr>
-        <w:t>Indicá qué frases son coherentes con el Manifiesto y corregí las demás. Relacioná cada respuesta con un valor y su aplicación al caso.</w:t>
+        <w:t>Indicá qué frases son coherentes con el Manifiesto Ágil y corregí las demás. Relacioná cada respuesta con uno de los cuatro valores.</w:t>
       </w:r>
     </w:p>
     <w:p>
       <w:pPr>
-        <w:numPr>
-          <w:ilvl w:val="0"/>
-          <w:numId w:val="12"/>
-        </w:numPr>
-        <w:spacing w:line="278" w:lineRule="auto" w:after="140"/>
+        <w:tabs>
+          <w:tab w:pos="425" w:val="left"/>
+        </w:tabs>
+        <w:spacing w:after="100"/>
+        <w:ind w:left="425" w:hanging="312"/>
       </w:pPr>
+      <w:r>
+        <w:rPr>
+          <w:b/>
+        </w:rPr>
+        <w:t>2.</w:t>
+        <w:tab/>
+      </w:r>
       <w:r>
         <w:rPr>
           <w:rFonts w:ascii="Calibri" w:hAnsi="Calibri"/>
           <w:sz w:val="22"/>
         </w:rPr>
-        <w:t>Elegí dos principios del módulo y proponé una conducta observable para cada uno durante el piloto. Evitá repetir el principio sin mostrar cómo se aplica.</w:t>
+        <w:t>Elegí dos de los doce principios y proponé una conducta concreta que el equipo pueda aplicar en el piloto para cada uno.</w:t>
       </w:r>
     </w:p>
     <w:p>
       <w:pPr>
-        <w:numPr>
-          <w:ilvl w:val="0"/>
-          <w:numId w:val="12"/>
-        </w:numPr>
-        <w:spacing w:line="278" w:lineRule="auto" w:after="140"/>
+        <w:tabs>
+          <w:tab w:pos="425" w:val="left"/>
+        </w:tabs>
+        <w:spacing w:after="100"/>
+        <w:ind w:left="425" w:hanging="312"/>
       </w:pPr>
+      <w:r>
+        <w:rPr>
+          <w:b/>
+        </w:rPr>
+        <w:t>3.</w:t>
+        <w:tab/>
+      </w:r>
       <w:r>
         <w:rPr>
           <w:rFonts w:ascii="Calibri" w:hAnsi="Calibri"/>
           <w:sz w:val="22"/>
         </w:rPr>
-        <w:t>Explicá por qué la entrega frecuente puede ayudar a aprender y por qué una demostración que todavía responde mal no prueba valor para el usuario.</w:t>
+        <w:t>Separá los datos en tres niveles: actividad, resultado entregado y beneficio.</w:t>
       </w:r>
+    </w:p>
+    <w:p>
+      <w:pPr>
+        <w:tabs>
+          <w:tab w:pos="425" w:val="left"/>
+        </w:tabs>
+        <w:spacing w:after="100"/>
+        <w:ind w:left="425" w:hanging="312"/>
+      </w:pPr>
+      <w:r>
+        <w:rPr>
+          <w:b/>
+        </w:rPr>
+        <w:t>4.</w:t>
+        <w:tab/>
+      </w:r>
+      <w:r>
+        <w:rPr>
+          <w:rFonts w:ascii="Calibri" w:hAnsi="Calibri"/>
+          <w:sz w:val="22"/>
+        </w:rPr>
+        <w:t>Calculá el porcentaje de respuestas correctas antes y después de la revisión. ¿Qué mejora muestran los datos y qué no permiten concluir todavía?</w:t>
+      </w:r>
+    </w:p>
+    <w:p>
+      <w:pPr>
+        <w:tabs>
+          <w:tab w:pos="425" w:val="left"/>
+        </w:tabs>
+        <w:spacing w:after="100"/>
+        <w:ind w:left="425" w:hanging="312"/>
+      </w:pPr>
+      <w:r>
+        <w:rPr>
+          <w:b/>
+        </w:rPr>
+        <w:t>5.</w:t>
+        <w:tab/>
+      </w:r>
+      <w:r>
+        <w:rPr>
+          <w:rFonts w:ascii="Calibri" w:hAnsi="Calibri"/>
+          <w:sz w:val="22"/>
+        </w:rPr>
+        <w:t>Formulá una hipótesis de valor y proponé una prueba con estudiantes que aporte la evidencia que falta.</w:t>
+      </w:r>
+    </w:p>
+    <w:p>
+      <w:pPr>
+        <w:pStyle w:val="Heading1"/>
+        <w:keepNext/>
+        <w:shd w:fill="EAF4FA"/>
+      </w:pPr>
+      <w:bookmarkStart w:id="5" w:name="seccion-5"/>
+      <w:r>
+        <w:rPr>
+          <w:rFonts w:ascii="Calibri" w:hAnsi="Calibri"/>
+          <w:b/>
+          <w:color w:val="173F67"/>
+          <w:sz w:val="34"/>
+        </w:rPr>
+        <w:t>Actividad 5: Analizar un caso real, el Virtual Case File del FBI</w:t>
+      </w:r>
+      <w:bookmarkEnd w:id="5"/>
     </w:p>
     <w:p>
       <w:pPr>
@@ -310,29 +1326,170 @@
           <w:color w:val="12655D"/>
           <w:sz w:val="22"/>
         </w:rPr>
-        <w:t>Consulta opcional.</w:t>
+        <w:t>Qué vas a practicar:</w:t>
       </w:r>
       <w:r>
         <w:rPr>
           <w:rFonts w:ascii="Calibri" w:hAnsi="Calibri"/>
           <w:sz w:val="22"/>
         </w:rPr>
-        <w:t xml:space="preserve"> Contrastá tu lectura con el </w:t>
+        <w:t xml:space="preserve"> leer un caso real separando lo que pasó, lo que se puede aprender y lo que no se puede concluir.</w:t>
       </w:r>
-      <w:hyperlink r:id="rId10">
-        <w:r>
-          <w:rPr>
-            <w:rStyle w:val="Hyperlink"/>
-          </w:rPr>
-          <w:t xml:space="preserve">Manifiesto Ágil en español</w:t>
-        </w:r>
-      </w:hyperlink>
+    </w:p>
+    <w:tbl>
+      <w:tblPr>
+        <w:tblW w:type="auto" w:w="0"/>
+        <w:tblLayout w:type="fixed"/>
+        <w:tblLook w:firstColumn="1" w:firstRow="1" w:lastColumn="0" w:lastRow="0" w:noHBand="0" w:noVBand="1" w:val="04A0"/>
+      </w:tblPr>
+      <w:tblGrid>
+        <w:gridCol w:w="9412"/>
+      </w:tblGrid>
+      <w:tr>
+        <w:trPr>
+          <w:cantSplit/>
+        </w:trPr>
+        <w:tc>
+          <w:tcPr>
+            <w:tcW w:type="dxa" w:w="9411"/>
+            <w:tcBorders>
+              <w:left w:val="single" w:sz="36" w:color="6A4A9C"/>
+              <w:top w:val="single" w:sz="4" w:color="6A4A9C"/>
+              <w:bottom w:val="single" w:sz="4" w:color="6A4A9C"/>
+              <w:right w:val="single" w:sz="4" w:color="6A4A9C"/>
+            </w:tcBorders>
+            <w:shd w:val="clear" w:fill="F1ECF8"/>
+            <w:tcMar>
+              <w:top w:w="140" w:type="dxa"/>
+              <w:bottom w:w="100" w:type="dxa"/>
+              <w:left w:w="220" w:type="dxa"/>
+              <w:right w:w="200" w:type="dxa"/>
+            </w:tcMar>
+          </w:tcPr>
+          <w:p>
+            <w:pPr>
+              <w:spacing w:after="100"/>
+            </w:pPr>
+            <w:r>
+              <w:rPr>
+                <w:rFonts w:ascii="Calibri" w:hAnsi="Calibri"/>
+                <w:b/>
+                <w:color w:val="6A4A9C"/>
+                <w:sz w:val="23"/>
+              </w:rPr>
+              <w:t>Situación</w:t>
+            </w:r>
+          </w:p>
+          <w:p>
+            <w:pPr>
+              <w:spacing w:after="120" w:line="276" w:lineRule="auto"/>
+            </w:pPr>
+            <w:r>
+              <w:rPr>
+                <w:rFonts w:ascii="Calibri" w:hAnsi="Calibri"/>
+                <w:sz w:val="22"/>
+              </w:rPr>
+              <w:t>Repasá el caso del Virtual Case File del FBI en la sección 2 del Contenido: un proyecto que empezó con un objetivo acotado, cambió su alcance a construir un sistema completamente nuevo, acumuló un documento de requisitos de más de 800 páginas y cerca de 400 pedidos de cambio en un año, y fue abandonado en 2005 después de gastar unos 170 millones de dólares.</w:t>
+            </w:r>
+          </w:p>
+        </w:tc>
+      </w:tr>
+    </w:tbl>
+    <w:p>
+      <w:pPr>
+        <w:spacing w:after="80"/>
+      </w:pPr>
+    </w:p>
+    <w:p>
+      <w:pPr>
+        <w:tabs>
+          <w:tab w:pos="425" w:val="left"/>
+        </w:tabs>
+        <w:spacing w:after="100"/>
+        <w:ind w:left="425" w:hanging="312"/>
+      </w:pPr>
+      <w:r>
+        <w:rPr>
+          <w:b/>
+        </w:rPr>
+        <w:t>1.</w:t>
+        <w:tab/>
+      </w:r>
       <w:r>
         <w:rPr>
           <w:rFonts w:ascii="Calibri" w:hAnsi="Calibri"/>
           <w:sz w:val="22"/>
         </w:rPr>
-        <w:t>. Observá cómo se establece una prioridad sin eliminar lo que se valora en segundo término. Si no podés abrirlo, usá las secciones 11 y 12 del Contenido.</w:t>
+        <w:t>Identificá dos señales de expansión descontrolada del alcance en el caso.</w:t>
+      </w:r>
+    </w:p>
+    <w:p>
+      <w:pPr>
+        <w:tabs>
+          <w:tab w:pos="425" w:val="left"/>
+        </w:tabs>
+        <w:spacing w:after="100"/>
+        <w:ind w:left="425" w:hanging="312"/>
+      </w:pPr>
+      <w:r>
+        <w:rPr>
+          <w:b/>
+        </w:rPr>
+        <w:t>2.</w:t>
+        <w:tab/>
+      </w:r>
+      <w:r>
+        <w:rPr>
+          <w:rFonts w:ascii="Calibri" w:hAnsi="Calibri"/>
+          <w:sz w:val="22"/>
+        </w:rPr>
+        <w:t>Explicá por qué un documento de requisitos de 800 páginas que especificaba hasta el color de los botones es un problema desde la idea de alcance del módulo.</w:t>
+      </w:r>
+    </w:p>
+    <w:p>
+      <w:pPr>
+        <w:tabs>
+          <w:tab w:pos="425" w:val="left"/>
+        </w:tabs>
+        <w:spacing w:after="100"/>
+        <w:ind w:left="425" w:hanging="312"/>
+      </w:pPr>
+      <w:r>
+        <w:rPr>
+          <w:b/>
+        </w:rPr>
+        <w:t>3.</w:t>
+        <w:tab/>
+      </w:r>
+      <w:r>
+        <w:rPr>
+          <w:rFonts w:ascii="Calibri" w:hAnsi="Calibri"/>
+          <w:sz w:val="22"/>
+        </w:rPr>
+        <w:t>Proponé dos prácticas vistas en el módulo que podrían haber ayudado. Relacioná cada una con un principio del Manifiesto.</w:t>
+      </w:r>
+    </w:p>
+    <w:p>
+      <w:pPr>
+        <w:tabs>
+          <w:tab w:pos="425" w:val="left"/>
+        </w:tabs>
+        <w:spacing w:after="100"/>
+        <w:ind w:left="425" w:hanging="312"/>
+      </w:pPr>
+      <w:r>
+        <w:rPr>
+          <w:b/>
+        </w:rPr>
+        <w:t>4.</w:t>
+        <w:tab/>
+      </w:r>
+      <w:r>
+        <w:rPr>
+          <w:rFonts w:ascii="Calibri" w:hAnsi="Calibri"/>
+          <w:sz w:val="22"/>
+        </w:rPr>
+        <w:t>¿El caso demuestra que un enfoque ágil lo habría salvado con seguridad? Explicá qué se puede aprender y qué no se puede concluir.</w:t>
       </w:r>
     </w:p>
     <w:p>
@@ -341,120 +1498,17 @@
         <w:keepNext/>
         <w:shd w:fill="EAF4FA"/>
       </w:pPr>
+      <w:bookmarkStart w:id="6" w:name="seccion-6"/>
       <w:r>
         <w:rPr>
           <w:rFonts w:ascii="Calibri" w:hAnsi="Calibri"/>
           <w:b/>
-          <w:color w:val="000000"/>
-          <w:sz w:val="32"/>
+          <w:color w:val="173F67"/>
+          <w:sz w:val="34"/>
         </w:rPr>
-        <w:t>Actividad 4 Distinguir trabajo realizado de valor</w:t>
+        <w:t>Antes de terminar</w:t>
       </w:r>
-    </w:p>
-    <w:p>
-      <w:pPr>
-        <w:spacing w:line="278" w:lineRule="auto" w:after="140"/>
-      </w:pPr>
-      <w:r>
-        <w:rPr>
-          <w:rFonts w:ascii="Calibri" w:hAnsi="Calibri"/>
-          <w:b/>
-          <w:color w:val="12655D"/>
-          <w:sz w:val="22"/>
-        </w:rPr>
-        <w:t>Caso de IA.</w:t>
-      </w:r>
-      <w:r>
-        <w:rPr>
-          <w:rFonts w:ascii="Calibri" w:hAnsi="Calibri"/>
-          <w:sz w:val="22"/>
-        </w:rPr>
-        <w:t xml:space="preserve"> En una prueba de 20 consultas definidas de antemano, el asistente orientó correctamente 12. Tras una revisión, resolvió 16 de las mismas 20. Además, el equipo cargó 40 documentos y completó 25 tareas. Todavía no se comprobó si los estudiantes entienden las respuestas ni si pueden terminar su trámite.</w:t>
-      </w:r>
-    </w:p>
-    <w:p>
-      <w:pPr>
-        <w:numPr>
-          <w:ilvl w:val="0"/>
-          <w:numId w:val="13"/>
-        </w:numPr>
-        <w:spacing w:line="278" w:lineRule="auto" w:after="140"/>
-      </w:pPr>
-      <w:r>
-        <w:rPr>
-          <w:rFonts w:ascii="Calibri" w:hAnsi="Calibri"/>
-          <w:sz w:val="22"/>
-        </w:rPr>
-        <w:t>Separá indicadores de trabajo realizado, evidencia de funcionamiento y evidencia de beneficio para usuarios.</w:t>
-      </w:r>
-    </w:p>
-    <w:p>
-      <w:pPr>
-        <w:numPr>
-          <w:ilvl w:val="0"/>
-          <w:numId w:val="13"/>
-        </w:numPr>
-        <w:spacing w:line="278" w:lineRule="auto" w:after="140"/>
-      </w:pPr>
-      <w:r>
-        <w:rPr>
-          <w:rFonts w:ascii="Calibri" w:hAnsi="Calibri"/>
-          <w:sz w:val="22"/>
-        </w:rPr>
-        <w:t>Calculá el porcentaje de consultas correctas antes y después. ¿Qué mejora muestran estos datos y qué conclusión todavía no permiten?</w:t>
-      </w:r>
-    </w:p>
-    <w:p>
-      <w:pPr>
-        <w:numPr>
-          <w:ilvl w:val="0"/>
-          <w:numId w:val="13"/>
-        </w:numPr>
-        <w:spacing w:line="278" w:lineRule="auto" w:after="140"/>
-      </w:pPr>
-      <w:r>
-        <w:rPr>
-          <w:rFonts w:ascii="Calibri" w:hAnsi="Calibri"/>
-          <w:sz w:val="22"/>
-        </w:rPr>
-        <w:t>Proponé una prueba con estudiantes que aporte la evidencia faltante, indicando qué observarías. Luego distinguí construir este asistente de usar una IA para resumir las reuniones del proyecto.</w:t>
-      </w:r>
-    </w:p>
-    <w:p>
-      <w:r>
-        <w:br w:type="page"/>
-      </w:r>
-    </w:p>
-    <w:p>
-      <w:pPr>
-        <w:pStyle w:val="Heading1"/>
-        <w:keepNext/>
-        <w:shd w:fill="EAF4FA"/>
-      </w:pPr>
-      <w:r>
-        <w:rPr>
-          <w:rFonts w:ascii="Calibri" w:hAnsi="Calibri"/>
-          <w:b/>
-          <w:color w:val="000000"/>
-          <w:sz w:val="32"/>
-        </w:rPr>
-        <w:t>Respuestas orientativas y autoevaluación</w:t>
-      </w:r>
-    </w:p>
-    <w:p>
-      <w:pPr>
-        <w:pStyle w:val="Heading2"/>
-        <w:keepNext/>
-      </w:pPr>
-      <w:r>
-        <w:rPr>
-          <w:rFonts w:ascii="Calibri" w:hAnsi="Calibri"/>
-          <w:b/>
-          <w:color w:val="000000"/>
-          <w:sz w:val="26"/>
-        </w:rPr>
-        <w:t>Actividad 1</w:t>
-      </w:r>
+      <w:bookmarkEnd w:id="6"/>
     </w:p>
     <w:p>
       <w:pPr>
@@ -465,134 +1519,185 @@
           <w:rFonts w:ascii="Calibri" w:hAnsi="Calibri"/>
           <w:sz w:val="22"/>
         </w:rPr>
-        <w:t>El proyecto es preparar y evaluar el piloto en el plazo acordado; el producto es el asistente; atender incidentes y actualizar información son operación. El cierre requiere contrastar resultados con criterios acordados, registrar aprendizajes y transferir responsabilidades, incluso si se decide no ampliar el piloto.</w:t>
+        <w:t>Estas actividades no tienen una única respuesta correcta: cada resolución puede ser distinta si está bien fundamentada en el Contenido del módulo. Si querés comparar tu trabajo, podés pedirle al profesor sus respuestas orientativas.</w:t>
       </w:r>
     </w:p>
+    <w:tbl>
+      <w:tblPr>
+        <w:tblW w:type="auto" w:w="0"/>
+        <w:tblLayout w:type="fixed"/>
+        <w:tblLook w:firstColumn="1" w:firstRow="1" w:lastColumn="0" w:lastRow="0" w:noHBand="0" w:noVBand="1" w:val="04A0"/>
+      </w:tblPr>
+      <w:tblGrid>
+        <w:gridCol w:w="9412"/>
+      </w:tblGrid>
+      <w:tr>
+        <w:trPr>
+          <w:cantSplit/>
+        </w:trPr>
+        <w:tc>
+          <w:tcPr>
+            <w:tcW w:type="dxa" w:w="9411"/>
+            <w:tcBorders>
+              <w:left w:val="single" w:sz="36" w:color="3A5BA0"/>
+              <w:top w:val="single" w:sz="4" w:color="3A5BA0"/>
+              <w:bottom w:val="single" w:sz="4" w:color="3A5BA0"/>
+              <w:right w:val="single" w:sz="4" w:color="3A5BA0"/>
+            </w:tcBorders>
+            <w:shd w:val="clear" w:fill="EEF2FB"/>
+            <w:tcMar>
+              <w:top w:w="140" w:type="dxa"/>
+              <w:bottom w:w="100" w:type="dxa"/>
+              <w:left w:w="220" w:type="dxa"/>
+              <w:right w:w="200" w:type="dxa"/>
+            </w:tcMar>
+          </w:tcPr>
+          <w:p>
+            <w:pPr>
+              <w:spacing w:after="100"/>
+            </w:pPr>
+            <w:r>
+              <w:rPr>
+                <w:rFonts w:ascii="Calibri" w:hAnsi="Calibri"/>
+                <w:b/>
+                <w:color w:val="3A5BA0"/>
+                <w:sz w:val="23"/>
+              </w:rPr>
+              <w:t>Para revisar tu trabajo</w:t>
+            </w:r>
+          </w:p>
+          <w:p>
+            <w:pPr>
+              <w:tabs>
+                <w:tab w:pos="340" w:val="left"/>
+              </w:tabs>
+              <w:spacing w:after="80"/>
+              <w:ind w:left="340" w:hanging="255"/>
+            </w:pPr>
+            <w:r>
+              <w:rPr>
+                <w:b/>
+                <w:color w:val="3A5BA0"/>
+                <w:sz w:val="21"/>
+              </w:rPr>
+              <w:t>•</w:t>
+              <w:tab/>
+            </w:r>
+            <w:r>
+              <w:rPr>
+                <w:rFonts w:ascii="Calibri" w:hAnsi="Calibri"/>
+                <w:sz w:val="22"/>
+              </w:rPr>
+              <w:t>¿Podés distinguir proyecto, producto y operación en un caso nuevo?</w:t>
+            </w:r>
+          </w:p>
+          <w:p>
+            <w:pPr>
+              <w:tabs>
+                <w:tab w:pos="340" w:val="left"/>
+              </w:tabs>
+              <w:spacing w:after="80"/>
+              <w:ind w:left="340" w:hanging="255"/>
+            </w:pPr>
+            <w:r>
+              <w:rPr>
+                <w:b/>
+                <w:color w:val="3A5BA0"/>
+                <w:sz w:val="21"/>
+              </w:rPr>
+              <w:t>•</w:t>
+              <w:tab/>
+            </w:r>
+            <w:r>
+              <w:rPr>
+                <w:rFonts w:ascii="Calibri" w:hAnsi="Calibri"/>
+                <w:sz w:val="22"/>
+              </w:rPr>
+              <w:t>¿Tus criterios de aceptación se pueden comprobar sin discusión?</w:t>
+            </w:r>
+          </w:p>
+          <w:p>
+            <w:pPr>
+              <w:tabs>
+                <w:tab w:pos="340" w:val="left"/>
+              </w:tabs>
+              <w:spacing w:after="80"/>
+              <w:ind w:left="340" w:hanging="255"/>
+            </w:pPr>
+            <w:r>
+              <w:rPr>
+                <w:b/>
+                <w:color w:val="3A5BA0"/>
+                <w:sz w:val="21"/>
+              </w:rPr>
+              <w:t>•</w:t>
+              <w:tab/>
+            </w:r>
+            <w:r>
+              <w:rPr>
+                <w:rFonts w:ascii="Calibri" w:hAnsi="Calibri"/>
+                <w:sz w:val="22"/>
+              </w:rPr>
+              <w:t>¿Justificaste la elección del enfoque con la incertidumbre y el costo de cambiar, y no con preferencias?</w:t>
+            </w:r>
+          </w:p>
+          <w:p>
+            <w:pPr>
+              <w:tabs>
+                <w:tab w:pos="340" w:val="left"/>
+              </w:tabs>
+              <w:spacing w:after="80"/>
+              <w:ind w:left="340" w:hanging="255"/>
+            </w:pPr>
+            <w:r>
+              <w:rPr>
+                <w:b/>
+                <w:color w:val="3A5BA0"/>
+                <w:sz w:val="21"/>
+              </w:rPr>
+              <w:t>•</w:t>
+              <w:tab/>
+            </w:r>
+            <w:r>
+              <w:rPr>
+                <w:rFonts w:ascii="Calibri" w:hAnsi="Calibri"/>
+                <w:sz w:val="22"/>
+              </w:rPr>
+              <w:t>¿Separaste actividad, resultado y beneficio?</w:t>
+            </w:r>
+          </w:p>
+          <w:p>
+            <w:pPr>
+              <w:tabs>
+                <w:tab w:pos="340" w:val="left"/>
+              </w:tabs>
+              <w:spacing w:after="80"/>
+              <w:ind w:left="340" w:hanging="255"/>
+            </w:pPr>
+            <w:r>
+              <w:rPr>
+                <w:b/>
+                <w:color w:val="3A5BA0"/>
+                <w:sz w:val="21"/>
+              </w:rPr>
+              <w:t>•</w:t>
+              <w:tab/>
+            </w:r>
+            <w:r>
+              <w:rPr>
+                <w:rFonts w:ascii="Calibri" w:hAnsi="Calibri"/>
+                <w:sz w:val="22"/>
+              </w:rPr>
+              <w:t>¿Al analizar el caso real, distinguiste lo que pasó de lo que no se puede concluir?</w:t>
+            </w:r>
+          </w:p>
+        </w:tc>
+      </w:tr>
+    </w:tbl>
     <w:p>
       <w:pPr>
-        <w:spacing w:line="278" w:lineRule="auto" w:after="140"/>
+        <w:spacing w:after="80"/>
       </w:pPr>
-      <w:r>
-        <w:rPr>
-          <w:rFonts w:ascii="Calibri" w:hAnsi="Calibri"/>
-          <w:sz w:val="22"/>
-        </w:rPr>
-        <w:t>La universidad encarga la solución; los estudiantes la usan; la dirección que autoriza recursos cumple la función de sponsor; alumnos aporta conocimiento de trámites. Involucrá a alumnos en la validación y a estudiantes en pruebas de comprensión. Autorizar corresponde a inicio; organizar, a planificación; integrar, a ejecución; comparar, a monitoreo y control; transferir responsabilidades, al cierre. Estas funciones pueden superponerse y repetirse.</w:t>
-      </w:r>
-    </w:p>
-    <w:p>
-      <w:pPr>
-        <w:pStyle w:val="Heading2"/>
-        <w:keepNext/>
-      </w:pPr>
-      <w:r>
-        <w:rPr>
-          <w:rFonts w:ascii="Calibri" w:hAnsi="Calibri"/>
-          <w:b/>
-          <w:color w:val="000000"/>
-          <w:sz w:val="26"/>
-        </w:rPr>
-        <w:t>Actividad 2</w:t>
-      </w:r>
-    </w:p>
-    <w:p>
-      <w:pPr>
-        <w:spacing w:line="278" w:lineRule="auto" w:after="140"/>
-      </w:pPr>
-      <w:r>
-        <w:rPr>
-          <w:rFonts w:ascii="Calibri" w:hAnsi="Calibri"/>
-          <w:sz w:val="22"/>
-        </w:rPr>
-        <w:t>A admite planificación predictiva por la estabilidad del procedimiento; B necesita prueba y adaptación; C admite coordinación híbrida. La elección debe justificar condiciones: errores previos en el procedimiento de A o falta de acceso a usuarios en B obligarían a revisar el diagnóstico. Mejorar lo existente es iterar; añadir becas es incrementar; añadirlas y revisarlas combina ambos movimientos.</w:t>
-      </w:r>
-    </w:p>
-    <w:p>
-      <w:pPr>
-        <w:spacing w:line="278" w:lineRule="auto" w:after="140"/>
-      </w:pPr>
-      <w:r>
-        <w:rPr>
-          <w:rFonts w:ascii="Calibri" w:hAnsi="Calibri"/>
-          <w:sz w:val="22"/>
-        </w:rPr>
-        <w:t>Ante el cambio, podés postergar becas o sustituir otra capacidad menos prioritaria, previa evaluación de dependencias. No conviene ocultar el aumento ni eliminar pruebas. Quienes tienen autoridad sobre recursos, el equipo y quienes conocen las necesidades aportan a la decisión.</w:t>
-      </w:r>
-    </w:p>
-    <w:p>
-      <w:pPr>
-        <w:pStyle w:val="Heading2"/>
-        <w:keepNext/>
-      </w:pPr>
-      <w:r>
-        <w:rPr>
-          <w:rFonts w:ascii="Calibri" w:hAnsi="Calibri"/>
-          <w:b/>
-          <w:color w:val="000000"/>
-          <w:sz w:val="26"/>
-        </w:rPr>
-        <w:t>Actividad 3</w:t>
-      </w:r>
-    </w:p>
-    <w:p>
-      <w:pPr>
-        <w:spacing w:line="278" w:lineRule="auto" w:after="140"/>
-      </w:pPr>
-      <w:r>
-        <w:rPr>
-          <w:rFonts w:ascii="Calibri" w:hAnsi="Calibri"/>
-          <w:sz w:val="22"/>
-        </w:rPr>
-        <w:t>A, B y C interpretan mal los valores; D es coherente. Registrar fuentes apoya la confiabilidad. Revisar una necesidad mal entendida permite adaptar el plan. La herramienta apoya la conversación, pero no reemplaza a quienes conocen el trámite. Dos aplicaciones posibles de los principios son probar una capacidad acotada con frecuencia y revisar regularmente cómo trabaja el equipo. La frecuencia sirve si permite comprobar calidad y utilidad.</w:t>
-      </w:r>
-    </w:p>
-    <w:p>
-      <w:pPr>
-        <w:pStyle w:val="Heading2"/>
-        <w:keepNext/>
-      </w:pPr>
-      <w:r>
-        <w:rPr>
-          <w:rFonts w:ascii="Calibri" w:hAnsi="Calibri"/>
-          <w:b/>
-          <w:color w:val="000000"/>
-          <w:sz w:val="26"/>
-        </w:rPr>
-        <w:t>Actividad 4</w:t>
-      </w:r>
-    </w:p>
-    <w:p>
-      <w:pPr>
-        <w:spacing w:line="278" w:lineRule="auto" w:after="140"/>
-      </w:pPr>
-      <w:r>
-        <w:rPr>
-          <w:rFonts w:ascii="Calibri" w:hAnsi="Calibri"/>
-          <w:sz w:val="22"/>
-        </w:rPr>
-        <w:t>Documentos y tareas describen actividad. Las respuestas correctas aportan evidencia de funcionamiento: 12/20 = 60 % y 16/20 = 80 %, una mejora de 20 puntos porcentuales en ese conjunto. No demuestra igual desempeño ante todas las consultas, comprensión ni beneficio real. Podés observar si estudiantes identifican los pasos de inscripción, dónde se confunden y cuándo necesitan ayuda, con tareas y criterios explícitos. Construir el asistente es el objeto del proyecto; resumir reuniones con IA es un apoyo a su gestión y requiere revisar el resumen.</w:t>
-      </w:r>
-    </w:p>
-    <w:p>
-      <w:pPr>
-        <w:spacing w:line="278" w:lineRule="auto" w:after="140"/>
-      </w:pPr>
-      <w:r>
-        <w:rPr>
-          <w:rFonts w:ascii="Calibri" w:hAnsi="Calibri"/>
-          <w:b/>
-          <w:color w:val="12655D"/>
-          <w:sz w:val="22"/>
-        </w:rPr>
-        <w:t>Antes de avanzar.</w:t>
-      </w:r>
-      <w:r>
-        <w:rPr>
-          <w:rFonts w:ascii="Calibri" w:hAnsi="Calibri"/>
-          <w:sz w:val="22"/>
-        </w:rPr>
-        <w:t xml:space="preserve"> Comprobá que distinguís los tres horizontes, justificás enfoques con datos, interpretás valores sin extremos y no confundís cantidad de tareas con valor. Si una respuesta queda genérica, agregá una decisión concreta del caso.</w:t>
-      </w:r>
     </w:p>
     <w:sectPr>
       <w:footerReference w:type="default" r:id="rId9"/>
@@ -823,58 +1928,6 @@
   </w:num>
   <w:num w:numId="9">
     <w:abstractNumId w:val="0"/>
-  </w:num>
-  <w:abstractNum w:abstractNumId="9">
-    <w:lvl w:ilvl="0">
-      <w:start w:val="1"/>
-      <w:numFmt w:val="decimal"/>
-      <w:lvlText w:val="%1."/>
-      <w:pPr>
-        <w:ind w:left="380" w:hanging="220"/>
-      </w:pPr>
-    </w:lvl>
-  </w:abstractNum>
-  <w:num w:numId="10">
-    <w:abstractNumId w:val="9"/>
-  </w:num>
-  <w:abstractNum w:abstractNumId="10">
-    <w:lvl w:ilvl="0">
-      <w:start w:val="1"/>
-      <w:numFmt w:val="decimal"/>
-      <w:lvlText w:val="%1."/>
-      <w:pPr>
-        <w:ind w:left="380" w:hanging="220"/>
-      </w:pPr>
-    </w:lvl>
-  </w:abstractNum>
-  <w:num w:numId="11">
-    <w:abstractNumId w:val="10"/>
-  </w:num>
-  <w:abstractNum w:abstractNumId="11">
-    <w:lvl w:ilvl="0">
-      <w:start w:val="1"/>
-      <w:numFmt w:val="decimal"/>
-      <w:lvlText w:val="%1."/>
-      <w:pPr>
-        <w:ind w:left="380" w:hanging="220"/>
-      </w:pPr>
-    </w:lvl>
-  </w:abstractNum>
-  <w:num w:numId="12">
-    <w:abstractNumId w:val="11"/>
-  </w:num>
-  <w:abstractNum w:abstractNumId="12">
-    <w:lvl w:ilvl="0">
-      <w:start w:val="1"/>
-      <w:numFmt w:val="decimal"/>
-      <w:lvlText w:val="%1."/>
-      <w:pPr>
-        <w:ind w:left="380" w:hanging="220"/>
-      </w:pPr>
-    </w:lvl>
-  </w:abstractNum>
-  <w:num w:numId="13">
-    <w:abstractNumId w:val="12"/>
   </w:num>
 </w:numbering>
 </file>
@@ -1111,8 +2164,8 @@
       <w:rFonts w:ascii="Calibri" w:hAnsi="Calibri"/>
       <w:b/>
       <w:bCs/>
-      <w:color w:val="000000"/>
-      <w:sz w:val="32"/>
+      <w:color w:val="173F67"/>
+      <w:sz w:val="34"/>
       <w:szCs w:val="28"/>
     </w:rPr>
   </w:style>
@@ -1135,7 +2188,7 @@
       <w:rFonts w:ascii="Calibri" w:hAnsi="Calibri"/>
       <w:b/>
       <w:bCs/>
-      <w:color w:val="000000"/>
+      <w:color w:val="12655D"/>
       <w:sz w:val="26"/>
       <w:szCs w:val="26"/>
     </w:rPr>
@@ -1159,7 +2212,7 @@
       <w:rFonts w:ascii="Calibri" w:hAnsi="Calibri"/>
       <w:b/>
       <w:bCs/>
-      <w:color w:val="000000"/>
+      <w:color w:val="5D3E83"/>
       <w:sz w:val="22"/>
     </w:rPr>
   </w:style>
@@ -1401,7 +2454,7 @@
       <w:color w:val="000000"/>
       <w:spacing w:val="5"/>
       <w:kern w:val="28"/>
-      <w:sz w:val="52"/>
+      <w:sz w:val="58"/>
       <w:szCs w:val="52"/>
     </w:rPr>
   </w:style>
@@ -1440,7 +2493,7 @@
       <w:b w:val="0"/>
       <w:i/>
       <w:iCs/>
-      <w:color w:val="000000"/>
+      <w:color w:val="536173"/>
       <w:spacing w:val="15"/>
       <w:sz w:val="26"/>
       <w:szCs w:val="24"/>

</xml_diff>